<commit_message>
Fix MDX-breaking <url> autolinks in Sources; use markdown links. Regenerate screens
</commit_message>
<xml_diff>
--- a/hub/static/research/companies/assorthealth.docx
+++ b/hub/static/research/companies/assorthealth.docx
@@ -3,20 +3,23 @@
 <w:document xmlns:wpc="http://schemas.microsoft.com/office/word/2010/wordprocessingCanvas" xmlns:mo="http://schemas.microsoft.com/office/mac/office/2008/main" xmlns:mc="http://schemas.openxmlformats.org/markup-compatibility/2006" xmlns:mv="urn:schemas-microsoft-com:mac:vml" xmlns:o="urn:schemas-microsoft-com:office:office" xmlns:r="http://schemas.openxmlformats.org/officeDocument/2006/relationships" xmlns:m="http://schemas.openxmlformats.org/officeDocument/2006/math" xmlns:v="urn:schemas-microsoft-com:vml" xmlns:wp14="http://schemas.microsoft.com/office/word/2010/wordprocessingDrawing" xmlns:wp="http://schemas.openxmlformats.org/drawingml/2006/wordprocessingDrawing" xmlns:w10="urn:schemas-microsoft-com:office:word" xmlns:w="http://schemas.openxmlformats.org/wordprocessingml/2006/main" xmlns:w14="http://schemas.microsoft.com/office/word/2010/wordml" xmlns:wpg="http://schemas.microsoft.com/office/word/2010/wordprocessingGroup" xmlns:wpi="http://schemas.microsoft.com/office/word/2010/wordprocessingInk" xmlns:wne="http://schemas.microsoft.com/office/word/2006/wordml" xmlns:wps="http://schemas.microsoft.com/office/word/2010/wordprocessingShape" mc:Ignorable="w14 wp14">
   <w:body>
     <w:p>
+      <w:pPr>
+        <w:spacing w:before="80" w:after="40"/>
+      </w:pPr>
       <w:r>
         <w:rPr>
           <w:rFonts w:ascii="Roboto Serif" w:hAnsi="Roboto Serif"/>
           <w:b/>
           <w:caps w:val="0"/>
           <w:color w:val="1A1A1A"/>
-          <w:sz w:val="48"/>
+          <w:sz w:val="44"/>
         </w:rPr>
         <w:t>Assort Health</w:t>
       </w:r>
     </w:p>
     <w:p>
       <w:pPr>
-        <w:spacing w:after="80"/>
+        <w:spacing w:after="40"/>
       </w:pPr>
       <w:r>
         <w:rPr>
@@ -24,18 +27,10 @@
           <w:b w:val="0"/>
           <w:caps w:val="0"/>
           <w:color w:val="828282"/>
-          <w:sz w:val="22"/>
+          <w:sz w:val="21"/>
         </w:rPr>
-        <w:t>assorthealth.com   ·   Series C   ·   San Francisco, CA   ·   Menlo Ventures</w:t>
+        <w:t>assorthealth.com   ·   Series C   ·   San Francisco, CA   ·   Menlo Ventures(Matthew Murphy)</w:t>
       </w:r>
-    </w:p>
-    <w:p>
-      <w:pPr>
-        <w:spacing w:after="320"/>
-        <w:pBdr>
-          <w:bottom w:val="single" w:sz="6" w:color="1A1A1A" w:space="4"/>
-        </w:pBdr>
-      </w:pPr>
     </w:p>
     <w:p>
       <w:pPr>
@@ -43,13 +38,46 @@
       </w:pPr>
       <w:r>
         <w:rPr>
+          <w:rFonts w:ascii="Sora" w:hAnsi="Sora"/>
+          <w:b w:val="0"/>
+          <w:caps w:val="0"/>
+          <w:color w:val="828282"/>
+          <w:sz w:val="18"/>
+        </w:rPr>
+        <w:t>Screened 2026-06-29</w:t>
+      </w:r>
+    </w:p>
+    <w:p>
+      <w:pPr>
+        <w:spacing w:after="120"/>
+        <w:pBdr>
+          <w:bottom w:val="single" w:sz="6" w:color="1A1A1A" w:space="4"/>
+        </w:pBdr>
+      </w:pPr>
+      <w:r>
+        <w:rPr>
           <w:rFonts w:ascii="Roboto Serif" w:hAnsi="Roboto Serif"/>
           <w:b/>
           <w:caps w:val="0"/>
           <w:color w:val="1A1A1A"/>
-          <w:sz w:val="30"/>
+          <w:sz w:val="28"/>
         </w:rPr>
-        <w:t>Fit score 3.2 / 4.0</w:t>
+        <w:t>FIT ASSESSMENT</w:t>
+      </w:r>
+    </w:p>
+    <w:p>
+      <w:pPr>
+        <w:spacing w:before="120" w:after="240"/>
+      </w:pPr>
+      <w:r>
+        <w:rPr>
+          <w:rFonts w:ascii="Roboto Serif" w:hAnsi="Roboto Serif"/>
+          <w:b/>
+          <w:caps w:val="0"/>
+          <w:color w:val="1A1A1A"/>
+          <w:sz w:val="32"/>
+        </w:rPr>
+        <w:t>2.8 / 4.0</w:t>
       </w:r>
       <w:r>
         <w:rPr>
@@ -59,7 +87,7 @@
           <w:color w:val="828282"/>
           <w:sz w:val="21"/>
         </w:rPr>
-        <w:t xml:space="preserve">   —   CLEARS GATE  ·  HIGH QUALITY</w:t>
+        <w:t xml:space="preserve">   —   BORDERLINE — REVIEW</w:t>
       </w:r>
     </w:p>
     <w:tbl>
@@ -69,20 +97,21 @@
         <w:tblLook w:firstColumn="1" w:firstRow="1" w:lastColumn="0" w:lastRow="0" w:noHBand="0" w:noVBand="1" w:val="04A0"/>
       </w:tblPr>
       <w:tblGrid>
-        <w:gridCol w:w="3216"/>
-        <w:gridCol w:w="3216"/>
-        <w:gridCol w:w="3216"/>
+        <w:gridCol w:w="3120"/>
+        <w:gridCol w:w="3120"/>
+        <w:gridCol w:w="3120"/>
       </w:tblGrid>
       <w:tr>
         <w:tc>
           <w:tcPr>
-            <w:tcW w:type="dxa" w:w="2736"/>
-            <w:tcBorders>
-              <w:top w:val="nil"/>
-              <w:left w:val="nil"/>
-              <w:right w:val="nil"/>
-              <w:bottom w:val="single" w:sz="8" w:color="1A1A1A"/>
-            </w:tcBorders>
+            <w:tcW w:type="dxa" w:w="2664"/>
+            <w:shd w:val="clear" w:color="auto" w:fill="1A1A1A"/>
+            <w:tcMar>
+              <w:top w:w="40" w:type="dxa"/>
+              <w:bottom w:w="40" w:type="dxa"/>
+              <w:left w:w="60" w:type="dxa"/>
+              <w:right w:w="60" w:type="dxa"/>
+            </w:tcMar>
           </w:tcPr>
           <w:p>
             <w:r>
@@ -90,8 +119,8 @@
                 <w:rFonts w:ascii="Sora" w:hAnsi="Sora"/>
                 <w:b/>
                 <w:caps/>
-                <w:color w:val="1A1A1A"/>
-                <w:sz w:val="17"/>
+                <w:color w:val="FFFFFF"/>
+                <w:sz w:val="18"/>
               </w:rPr>
               <w:t>Dimension</w:t>
             </w:r>
@@ -99,13 +128,14 @@
         </w:tc>
         <w:tc>
           <w:tcPr>
-            <w:tcW w:type="dxa" w:w="864"/>
-            <w:tcBorders>
-              <w:top w:val="nil"/>
-              <w:left w:val="nil"/>
-              <w:right w:val="nil"/>
-              <w:bottom w:val="single" w:sz="8" w:color="1A1A1A"/>
-            </w:tcBorders>
+            <w:tcW w:type="dxa" w:w="792"/>
+            <w:shd w:val="clear" w:color="auto" w:fill="1A1A1A"/>
+            <w:tcMar>
+              <w:top w:w="40" w:type="dxa"/>
+              <w:bottom w:w="40" w:type="dxa"/>
+              <w:left w:w="60" w:type="dxa"/>
+              <w:right w:w="60" w:type="dxa"/>
+            </w:tcMar>
           </w:tcPr>
           <w:p>
             <w:r>
@@ -113,8 +143,8 @@
                 <w:rFonts w:ascii="Sora" w:hAnsi="Sora"/>
                 <w:b/>
                 <w:caps/>
-                <w:color w:val="1A1A1A"/>
-                <w:sz w:val="17"/>
+                <w:color w:val="FFFFFF"/>
+                <w:sz w:val="18"/>
               </w:rPr>
               <w:t>Score</w:t>
             </w:r>
@@ -122,13 +152,14 @@
         </w:tc>
         <w:tc>
           <w:tcPr>
-            <w:tcW w:type="dxa" w:w="6336"/>
-            <w:tcBorders>
-              <w:top w:val="nil"/>
-              <w:left w:val="nil"/>
-              <w:right w:val="nil"/>
-              <w:bottom w:val="single" w:sz="8" w:color="1A1A1A"/>
-            </w:tcBorders>
+            <w:tcW w:type="dxa" w:w="5904"/>
+            <w:shd w:val="clear" w:color="auto" w:fill="1A1A1A"/>
+            <w:tcMar>
+              <w:top w:w="40" w:type="dxa"/>
+              <w:bottom w:w="40" w:type="dxa"/>
+              <w:left w:w="60" w:type="dxa"/>
+              <w:right w:w="60" w:type="dxa"/>
+            </w:tcMar>
           </w:tcPr>
           <w:p>
             <w:r>
@@ -136,8 +167,8 @@
                 <w:rFonts w:ascii="Sora" w:hAnsi="Sora"/>
                 <w:b/>
                 <w:caps/>
-                <w:color w:val="1A1A1A"/>
-                <w:sz w:val="17"/>
+                <w:color w:val="FFFFFF"/>
+                <w:sz w:val="18"/>
               </w:rPr>
               <w:t>Evidence</w:t>
             </w:r>
@@ -147,7 +178,14 @@
       <w:tr>
         <w:tc>
           <w:tcPr>
-            <w:tcW w:type="dxa" w:w="2736"/>
+            <w:tcW w:type="dxa" w:w="2664"/>
+            <w:shd w:val="clear" w:color="auto" w:fill="F5F5F5"/>
+            <w:tcMar>
+              <w:top w:w="40" w:type="dxa"/>
+              <w:bottom w:w="40" w:type="dxa"/>
+              <w:left w:w="60" w:type="dxa"/>
+              <w:right w:w="60" w:type="dxa"/>
+            </w:tcMar>
             <w:tcBorders>
               <w:top w:val="nil"/>
               <w:left w:val="nil"/>
@@ -170,7 +208,14 @@
         </w:tc>
         <w:tc>
           <w:tcPr>
-            <w:tcW w:type="dxa" w:w="864"/>
+            <w:tcW w:type="dxa" w:w="792"/>
+            <w:shd w:val="clear" w:color="auto" w:fill="F5F5F5"/>
+            <w:tcMar>
+              <w:top w:w="40" w:type="dxa"/>
+              <w:bottom w:w="40" w:type="dxa"/>
+              <w:left w:w="60" w:type="dxa"/>
+              <w:right w:w="60" w:type="dxa"/>
+            </w:tcMar>
             <w:tcBorders>
               <w:top w:val="nil"/>
               <w:left w:val="nil"/>
@@ -182,18 +227,35 @@
             <w:r>
               <w:rPr>
                 <w:rFonts w:ascii="Sora" w:hAnsi="Sora"/>
-                <w:b w:val="0"/>
+                <w:b/>
                 <w:caps w:val="0"/>
                 <w:color w:val="1A1A1A"/>
                 <w:sz w:val="19"/>
               </w:rPr>
-              <w:t>4</w:t>
+              <w:t>3</w:t>
+            </w:r>
+            <w:r>
+              <w:rPr>
+                <w:rFonts w:ascii="Sora" w:hAnsi="Sora"/>
+                <w:b w:val="0"/>
+                <w:caps w:val="0"/>
+                <w:color w:val="828282"/>
+                <w:sz w:val="17"/>
+              </w:rPr>
+              <w:t xml:space="preserve"> / 4</w:t>
             </w:r>
           </w:p>
         </w:tc>
         <w:tc>
           <w:tcPr>
-            <w:tcW w:type="dxa" w:w="6336"/>
+            <w:tcW w:type="dxa" w:w="5904"/>
+            <w:shd w:val="clear" w:color="auto" w:fill="F5F5F5"/>
+            <w:tcMar>
+              <w:top w:w="40" w:type="dxa"/>
+              <w:bottom w:w="40" w:type="dxa"/>
+              <w:left w:w="60" w:type="dxa"/>
+              <w:right w:w="60" w:type="dxa"/>
+            </w:tcMar>
             <w:tcBorders>
               <w:top w:val="nil"/>
               <w:left w:val="nil"/>
@@ -210,47 +272,7 @@
                 <w:color w:val="3C3C3C"/>
                 <w:sz w:val="18"/>
               </w:rPr>
-              <w:t xml:space="preserve">Assort Health announced a $120M Series C </w:t>
-            </w:r>
-            <w:r>
-              <w:rPr>
-                <w:rFonts w:ascii="Sora" w:hAnsi="Sora"/>
-                <w:b/>
-                <w:caps w:val="0"/>
-                <w:color w:val="3C3C3C"/>
-                <w:sz w:val="18"/>
-              </w:rPr>
-              <w:t>primary</w:t>
-            </w:r>
-            <w:r>
-              <w:rPr>
-                <w:rFonts w:ascii="Sora" w:hAnsi="Sora"/>
-                <w:b w:val="0"/>
-                <w:caps w:val="0"/>
-                <w:color w:val="3C3C3C"/>
-                <w:sz w:val="18"/>
-              </w:rPr>
-              <w:t xml:space="preserve"> round led by Menlo Ventures, a widely recognized top-tier VC, at a $1.2B valuation.[3][9] This is Menlo’s first time leading a round in Assort (prior rounds were led by other funds such as Lightspeed and Felicis), so this matches a </w:t>
-            </w:r>
-            <w:r>
-              <w:rPr>
-                <w:rFonts w:ascii="Sora" w:hAnsi="Sora"/>
-                <w:b/>
-                <w:caps w:val="0"/>
-                <w:color w:val="3C3C3C"/>
-                <w:sz w:val="18"/>
-              </w:rPr>
-              <w:t>new-money top-tier lead, Series B+</w:t>
-            </w:r>
-            <w:r>
-              <w:rPr>
-                <w:rFonts w:ascii="Sora" w:hAnsi="Sora"/>
-                <w:b w:val="0"/>
-                <w:caps w:val="0"/>
-                <w:color w:val="3C3C3C"/>
-                <w:sz w:val="18"/>
-              </w:rPr>
-              <w:t xml:space="preserve"> profile rather than an inside/extension round.[3][5][9]</w:t>
+              <w:t>Assort Health raised a $120M Series C led by Menlo Ventures at a $1.2B valuation, with participation from Lightspeed, Felicis, First Round, Chemistry, Tau, Quiet Capital and others, forming a top-tier syndicate.[3][2][9] Menlo appears to be a new-money lead at Series C (prior rounds were led by other investors), but Menlo is generally considered strong upper-tier rather than the absolute top tier, so this fits the ‘near-top-tier new-money Series B+ with top-tier syndicate’ band rather than a clear score-4 new-money top-tier lead.[3][8][9]</w:t>
             </w:r>
           </w:p>
         </w:tc>
@@ -258,7 +280,14 @@
       <w:tr>
         <w:tc>
           <w:tcPr>
-            <w:tcW w:type="dxa" w:w="2736"/>
+            <w:tcW w:type="dxa" w:w="2664"/>
+            <w:shd w:val="clear" w:color="auto" w:fill="FFFFFF"/>
+            <w:tcMar>
+              <w:top w:w="40" w:type="dxa"/>
+              <w:bottom w:w="40" w:type="dxa"/>
+              <w:left w:w="60" w:type="dxa"/>
+              <w:right w:w="60" w:type="dxa"/>
+            </w:tcMar>
             <w:tcBorders>
               <w:top w:val="nil"/>
               <w:left w:val="nil"/>
@@ -281,7 +310,14 @@
         </w:tc>
         <w:tc>
           <w:tcPr>
-            <w:tcW w:type="dxa" w:w="864"/>
+            <w:tcW w:type="dxa" w:w="792"/>
+            <w:shd w:val="clear" w:color="auto" w:fill="FFFFFF"/>
+            <w:tcMar>
+              <w:top w:w="40" w:type="dxa"/>
+              <w:bottom w:w="40" w:type="dxa"/>
+              <w:left w:w="60" w:type="dxa"/>
+              <w:right w:w="60" w:type="dxa"/>
+            </w:tcMar>
             <w:tcBorders>
               <w:top w:val="nil"/>
               <w:left w:val="nil"/>
@@ -293,18 +329,35 @@
             <w:r>
               <w:rPr>
                 <w:rFonts w:ascii="Sora" w:hAnsi="Sora"/>
-                <w:b w:val="0"/>
+                <w:b/>
                 <w:caps w:val="0"/>
                 <w:color w:val="1A1A1A"/>
                 <w:sz w:val="19"/>
               </w:rPr>
               <w:t>4</w:t>
             </w:r>
+            <w:r>
+              <w:rPr>
+                <w:rFonts w:ascii="Sora" w:hAnsi="Sora"/>
+                <w:b w:val="0"/>
+                <w:caps w:val="0"/>
+                <w:color w:val="828282"/>
+                <w:sz w:val="17"/>
+              </w:rPr>
+              <w:t xml:space="preserve"> / 4</w:t>
+            </w:r>
           </w:p>
         </w:tc>
         <w:tc>
           <w:tcPr>
-            <w:tcW w:type="dxa" w:w="6336"/>
+            <w:tcW w:type="dxa" w:w="5904"/>
+            <w:shd w:val="clear" w:color="auto" w:fill="FFFFFF"/>
+            <w:tcMar>
+              <w:top w:w="40" w:type="dxa"/>
+              <w:bottom w:w="40" w:type="dxa"/>
+              <w:left w:w="60" w:type="dxa"/>
+              <w:right w:w="60" w:type="dxa"/>
+            </w:tcMar>
             <w:tcBorders>
               <w:top w:val="nil"/>
               <w:left w:val="nil"/>
@@ -321,47 +374,7 @@
                 <w:color w:val="3C3C3C"/>
                 <w:sz w:val="18"/>
               </w:rPr>
-              <w:t xml:space="preserve">Assort describes itself as “the most widely-used </w:t>
-            </w:r>
-            <w:r>
-              <w:rPr>
-                <w:rFonts w:ascii="Sora" w:hAnsi="Sora"/>
-                <w:b/>
-                <w:caps w:val="0"/>
-                <w:color w:val="3C3C3C"/>
-                <w:sz w:val="18"/>
-              </w:rPr>
-              <w:t>AI agents platform</w:t>
-            </w:r>
-            <w:r>
-              <w:rPr>
-                <w:rFonts w:ascii="Sora" w:hAnsi="Sora"/>
-                <w:b w:val="0"/>
-                <w:caps w:val="0"/>
-                <w:color w:val="3C3C3C"/>
-                <w:sz w:val="18"/>
-              </w:rPr>
-              <w:t xml:space="preserve"> for the patient journey,” offering AI agents for scheduling, intake, triage and other patient-access workflows.[3][4][5] Coverage consistently calls it a “voice AI agent startup” and “AI-powered patient access platform,” making it a </w:t>
-            </w:r>
-            <w:r>
-              <w:rPr>
-                <w:rFonts w:ascii="Sora" w:hAnsi="Sora"/>
-                <w:b/>
-                <w:caps w:val="0"/>
-                <w:color w:val="3C3C3C"/>
-                <w:sz w:val="18"/>
-              </w:rPr>
-              <w:t>pure-play AI</w:t>
-            </w:r>
-            <w:r>
-              <w:rPr>
-                <w:rFonts w:ascii="Sora" w:hAnsi="Sora"/>
-                <w:b w:val="0"/>
-                <w:caps w:val="0"/>
-                <w:color w:val="3C3C3C"/>
-                <w:sz w:val="18"/>
-              </w:rPr>
-              <w:t xml:space="preserve"> company with AI as the core product, not a peripheral feature.[1][4][7]</w:t>
+              <w:t>Assort Health is described as "the most widely-used AI agents platform for the patient journey" and a "voice AI agent platform for healthcare," indicating that AI agents are the core product rather than a peripheral feature.[3][1][7] Menlo characterizes it as "the AI platform transforming the front door of healthcare," reinforcing that it is a pure-play AI company focused on AI automation of patient communication and the care journey.[9][8]</w:t>
             </w:r>
           </w:p>
         </w:tc>
@@ -369,7 +382,14 @@
       <w:tr>
         <w:tc>
           <w:tcPr>
-            <w:tcW w:type="dxa" w:w="2736"/>
+            <w:tcW w:type="dxa" w:w="2664"/>
+            <w:shd w:val="clear" w:color="auto" w:fill="F5F5F5"/>
+            <w:tcMar>
+              <w:top w:w="40" w:type="dxa"/>
+              <w:bottom w:w="40" w:type="dxa"/>
+              <w:left w:w="60" w:type="dxa"/>
+              <w:right w:w="60" w:type="dxa"/>
+            </w:tcMar>
             <w:tcBorders>
               <w:top w:val="nil"/>
               <w:left w:val="nil"/>
@@ -392,7 +412,14 @@
         </w:tc>
         <w:tc>
           <w:tcPr>
-            <w:tcW w:type="dxa" w:w="864"/>
+            <w:tcW w:type="dxa" w:w="792"/>
+            <w:shd w:val="clear" w:color="auto" w:fill="F5F5F5"/>
+            <w:tcMar>
+              <w:top w:w="40" w:type="dxa"/>
+              <w:bottom w:w="40" w:type="dxa"/>
+              <w:left w:w="60" w:type="dxa"/>
+              <w:right w:w="60" w:type="dxa"/>
+            </w:tcMar>
             <w:tcBorders>
               <w:top w:val="nil"/>
               <w:left w:val="nil"/>
@@ -404,18 +431,35 @@
             <w:r>
               <w:rPr>
                 <w:rFonts w:ascii="Sora" w:hAnsi="Sora"/>
-                <w:b w:val="0"/>
+                <w:b/>
                 <w:caps w:val="0"/>
                 <w:color w:val="1A1A1A"/>
                 <w:sz w:val="19"/>
               </w:rPr>
               <w:t>2</w:t>
             </w:r>
+            <w:r>
+              <w:rPr>
+                <w:rFonts w:ascii="Sora" w:hAnsi="Sora"/>
+                <w:b w:val="0"/>
+                <w:caps w:val="0"/>
+                <w:color w:val="828282"/>
+                <w:sz w:val="17"/>
+              </w:rPr>
+              <w:t xml:space="preserve"> / 4</w:t>
+            </w:r>
           </w:p>
         </w:tc>
         <w:tc>
           <w:tcPr>
-            <w:tcW w:type="dxa" w:w="6336"/>
+            <w:tcW w:type="dxa" w:w="5904"/>
+            <w:shd w:val="clear" w:color="auto" w:fill="F5F5F5"/>
+            <w:tcMar>
+              <w:top w:w="40" w:type="dxa"/>
+              <w:bottom w:w="40" w:type="dxa"/>
+              <w:left w:w="60" w:type="dxa"/>
+              <w:right w:w="60" w:type="dxa"/>
+            </w:tcMar>
             <w:tcBorders>
               <w:top w:val="nil"/>
               <w:left w:val="nil"/>
@@ -432,47 +476,7 @@
                 <w:color w:val="3C3C3C"/>
                 <w:sz w:val="18"/>
               </w:rPr>
-              <w:t xml:space="preserve">Public sources emphasize strong commercial momentum and large-scale deployments but do </w:t>
-            </w:r>
-            <w:r>
-              <w:rPr>
-                <w:rFonts w:ascii="Sora" w:hAnsi="Sora"/>
-                <w:b/>
-                <w:caps w:val="0"/>
-                <w:color w:val="3C3C3C"/>
-                <w:sz w:val="18"/>
-              </w:rPr>
-              <w:t>not</w:t>
-            </w:r>
-            <w:r>
-              <w:rPr>
-                <w:rFonts w:ascii="Sora" w:hAnsi="Sora"/>
-                <w:b w:val="0"/>
-                <w:caps w:val="0"/>
-                <w:color w:val="3C3C3C"/>
-                <w:sz w:val="18"/>
-              </w:rPr>
-              <w:t xml:space="preserve"> disclose revenue, growth rate, NDR, or LTV/CAC.[3][4][7] Articles note “rapid commercial growth over the past 15 months” and that the company powers some of the largest AI-agent deployments in healthcare, implying traction above an early-stage sub-$5M profile, but without quantified metrics it cannot be scored at the &gt;$25M/70%+ growth bar, so a </w:t>
-            </w:r>
-            <w:r>
-              <w:rPr>
-                <w:rFonts w:ascii="Sora" w:hAnsi="Sora"/>
-                <w:b/>
-                <w:caps w:val="0"/>
-                <w:color w:val="3C3C3C"/>
-                <w:sz w:val="18"/>
-              </w:rPr>
-              <w:t>conservative mid-band (2)</w:t>
-            </w:r>
-            <w:r>
-              <w:rPr>
-                <w:rFonts w:ascii="Sora" w:hAnsi="Sora"/>
-                <w:b w:val="0"/>
-                <w:caps w:val="0"/>
-                <w:color w:val="3C3C3C"/>
-                <w:sz w:val="18"/>
-              </w:rPr>
-              <w:t xml:space="preserve"> is appropriate.[3][4]</w:t>
+              <w:t>Public sources on the Series C announcement highlight total funding ($222M), product traction and deployment breadth, but do not provide hard metrics on revenue, growth rate, net dollar retention, LTV/CAC or burn.[3][4][7] The $1.2B valuation and description as "the most widely-used" platform for AI agents in the patient journey suggest meaningful scale and a strong value proposition in healthcare operations, but absence of quantitative fundamentals data warrants a cautious score between the weak-metric floor and the &gt;$25M/70%+ growth bar.[3][1][8]</w:t>
             </w:r>
           </w:p>
         </w:tc>
@@ -480,7 +484,14 @@
       <w:tr>
         <w:tc>
           <w:tcPr>
-            <w:tcW w:type="dxa" w:w="2736"/>
+            <w:tcW w:type="dxa" w:w="2664"/>
+            <w:shd w:val="clear" w:color="auto" w:fill="FFFFFF"/>
+            <w:tcMar>
+              <w:top w:w="40" w:type="dxa"/>
+              <w:bottom w:w="40" w:type="dxa"/>
+              <w:left w:w="60" w:type="dxa"/>
+              <w:right w:w="60" w:type="dxa"/>
+            </w:tcMar>
             <w:tcBorders>
               <w:top w:val="nil"/>
               <w:left w:val="nil"/>
@@ -503,7 +514,14 @@
         </w:tc>
         <w:tc>
           <w:tcPr>
-            <w:tcW w:type="dxa" w:w="864"/>
+            <w:tcW w:type="dxa" w:w="792"/>
+            <w:shd w:val="clear" w:color="auto" w:fill="FFFFFF"/>
+            <w:tcMar>
+              <w:top w:w="40" w:type="dxa"/>
+              <w:bottom w:w="40" w:type="dxa"/>
+              <w:left w:w="60" w:type="dxa"/>
+              <w:right w:w="60" w:type="dxa"/>
+            </w:tcMar>
             <w:tcBorders>
               <w:top w:val="nil"/>
               <w:left w:val="nil"/>
@@ -515,18 +533,35 @@
             <w:r>
               <w:rPr>
                 <w:rFonts w:ascii="Sora" w:hAnsi="Sora"/>
-                <w:b w:val="0"/>
+                <w:b/>
                 <w:caps w:val="0"/>
                 <w:color w:val="1A1A1A"/>
                 <w:sz w:val="19"/>
               </w:rPr>
               <w:t>3</w:t>
             </w:r>
+            <w:r>
+              <w:rPr>
+                <w:rFonts w:ascii="Sora" w:hAnsi="Sora"/>
+                <w:b w:val="0"/>
+                <w:caps w:val="0"/>
+                <w:color w:val="828282"/>
+                <w:sz w:val="17"/>
+              </w:rPr>
+              <w:t xml:space="preserve"> / 4</w:t>
+            </w:r>
           </w:p>
         </w:tc>
         <w:tc>
           <w:tcPr>
-            <w:tcW w:type="dxa" w:w="6336"/>
+            <w:tcW w:type="dxa" w:w="5904"/>
+            <w:shd w:val="clear" w:color="auto" w:fill="FFFFFF"/>
+            <w:tcMar>
+              <w:top w:w="40" w:type="dxa"/>
+              <w:bottom w:w="40" w:type="dxa"/>
+              <w:left w:w="60" w:type="dxa"/>
+              <w:right w:w="60" w:type="dxa"/>
+            </w:tcMar>
             <w:tcBorders>
               <w:top w:val="nil"/>
               <w:left w:val="nil"/>
@@ -543,27 +578,7 @@
                 <w:color w:val="3C3C3C"/>
                 <w:sz w:val="18"/>
               </w:rPr>
-              <w:t xml:space="preserve">The $120M Series C at a $1.2B valuation in a large and growing healthcare workflow TAM, combined with pure-play AI positioning and strong syndicate (Menlo, Lightspeed, Felicis, First Round, etc.), suggests meaningful upside potential beyond 3x if execution continues.[2][3][4] However, at unicorn entry price and without disclosed profitability or retention metrics, there is still non-trivial risk of capital loss, aligning best with the </w:t>
-            </w:r>
-            <w:r>
-              <w:rPr>
-                <w:rFonts w:ascii="Sora" w:hAnsi="Sora"/>
-                <w:b/>
-                <w:caps w:val="0"/>
-                <w:color w:val="3C3C3C"/>
-                <w:sz w:val="18"/>
-              </w:rPr>
-              <w:t>&gt;3x potential with some risk</w:t>
-            </w:r>
-            <w:r>
-              <w:rPr>
-                <w:rFonts w:ascii="Sora" w:hAnsi="Sora"/>
-                <w:b w:val="0"/>
-                <w:caps w:val="0"/>
-                <w:color w:val="3C3C3C"/>
-                <w:sz w:val="18"/>
-              </w:rPr>
-              <w:t xml:space="preserve"> band.[3][7][8]</w:t>
+              <w:t>Assort is a pure-play AI infrastructure company in healthcare, a large and structurally growing market, and has reached a $1.2B valuation at Series C with broad top-tier participation, implying potential for substantial upside if it can become a category-defining platform.[3][1][7] However, given the late stage, high entry valuation and typical healthcare enterprise sales risks, the probability of &gt;7x with little capital-loss risk is uncertain, better fitting a &gt;3x potential with some risk of capital loss rather than the most optimistic band.[3][8]</w:t>
             </w:r>
           </w:p>
         </w:tc>
@@ -571,7 +586,14 @@
       <w:tr>
         <w:tc>
           <w:tcPr>
-            <w:tcW w:type="dxa" w:w="2736"/>
+            <w:tcW w:type="dxa" w:w="2664"/>
+            <w:shd w:val="clear" w:color="auto" w:fill="F5F5F5"/>
+            <w:tcMar>
+              <w:top w:w="40" w:type="dxa"/>
+              <w:bottom w:w="40" w:type="dxa"/>
+              <w:left w:w="60" w:type="dxa"/>
+              <w:right w:w="60" w:type="dxa"/>
+            </w:tcMar>
             <w:tcBorders>
               <w:top w:val="nil"/>
               <w:left w:val="nil"/>
@@ -594,7 +616,14 @@
         </w:tc>
         <w:tc>
           <w:tcPr>
-            <w:tcW w:type="dxa" w:w="864"/>
+            <w:tcW w:type="dxa" w:w="792"/>
+            <w:shd w:val="clear" w:color="auto" w:fill="F5F5F5"/>
+            <w:tcMar>
+              <w:top w:w="40" w:type="dxa"/>
+              <w:bottom w:w="40" w:type="dxa"/>
+              <w:left w:w="60" w:type="dxa"/>
+              <w:right w:w="60" w:type="dxa"/>
+            </w:tcMar>
             <w:tcBorders>
               <w:top w:val="nil"/>
               <w:left w:val="nil"/>
@@ -606,18 +635,35 @@
             <w:r>
               <w:rPr>
                 <w:rFonts w:ascii="Sora" w:hAnsi="Sora"/>
-                <w:b w:val="0"/>
+                <w:b/>
                 <w:caps w:val="0"/>
                 <w:color w:val="1A1A1A"/>
                 <w:sz w:val="19"/>
               </w:rPr>
-              <w:t>3</w:t>
+              <w:t>2</w:t>
+            </w:r>
+            <w:r>
+              <w:rPr>
+                <w:rFonts w:ascii="Sora" w:hAnsi="Sora"/>
+                <w:b w:val="0"/>
+                <w:caps w:val="0"/>
+                <w:color w:val="828282"/>
+                <w:sz w:val="17"/>
+              </w:rPr>
+              <w:t xml:space="preserve"> / 4</w:t>
             </w:r>
           </w:p>
         </w:tc>
         <w:tc>
           <w:tcPr>
-            <w:tcW w:type="dxa" w:w="6336"/>
+            <w:tcW w:type="dxa" w:w="5904"/>
+            <w:shd w:val="clear" w:color="auto" w:fill="F5F5F5"/>
+            <w:tcMar>
+              <w:top w:w="40" w:type="dxa"/>
+              <w:bottom w:w="40" w:type="dxa"/>
+              <w:left w:w="60" w:type="dxa"/>
+              <w:right w:w="60" w:type="dxa"/>
+            </w:tcMar>
             <w:tcBorders>
               <w:top w:val="nil"/>
               <w:left w:val="nil"/>
@@ -634,27 +680,7 @@
                 <w:color w:val="3C3C3C"/>
                 <w:sz w:val="18"/>
               </w:rPr>
-              <w:t xml:space="preserve">This is a straightforward institutional Series C with a top-tier lead and standard multi-VC syndicate; there is no indication of unusual structures like multi-layer SPVs, excessive fees, or highly compressed time horizons.[2][3][9] For an ID8 SPV alongside Menlo, this would likely be structured at or near </w:t>
-            </w:r>
-            <w:r>
-              <w:rPr>
-                <w:rFonts w:ascii="Sora" w:hAnsi="Sora"/>
-                <w:b/>
-                <w:caps w:val="0"/>
-                <w:color w:val="3C3C3C"/>
-                <w:sz w:val="18"/>
-              </w:rPr>
-              <w:t>0/10 economics with a normal growth-stage time horizon and reasonable public data</w:t>
-            </w:r>
-            <w:r>
-              <w:rPr>
-                <w:rFonts w:ascii="Sora" w:hAnsi="Sora"/>
-                <w:b w:val="0"/>
-                <w:caps w:val="0"/>
-                <w:color w:val="3C3C3C"/>
-                <w:sz w:val="18"/>
-              </w:rPr>
-              <w:t>, fitting the Score 3 anchor better than the more-optimistic Score 4 given lack of explicit terms disclosure.[3][8]</w:t>
+              <w:t>Available reporting on the Series C focuses on round size, lead, valuation and investor list, with no disclosure of SPV terms, carry, fees, time horizon, or specific secondary/structure details relevant to ID8’s entry.[3][2][7] In the absence of concrete terms data, and given this is a standard primary Series C led by a mainstream VC, the most conservative assumption is a typical 0/10-style co-invest/SPV structure with limited visibility, which aligns best with a mid-band score rather than crediting fully ‘0/10 SPV with good data.’none found</w:t>
             </w:r>
           </w:p>
         </w:tc>
@@ -662,24 +688,30 @@
     </w:tbl>
     <w:p>
       <w:pPr>
-        <w:spacing w:after="80"/>
+        <w:spacing w:after="160"/>
       </w:pPr>
     </w:p>
     <w:p>
+      <w:pPr>
+        <w:spacing w:after="120"/>
+        <w:pBdr>
+          <w:bottom w:val="single" w:sz="6" w:color="1A1A1A" w:space="4"/>
+        </w:pBdr>
+      </w:pPr>
       <w:r>
         <w:rPr>
-          <w:rFonts w:ascii="Sora" w:hAnsi="Sora"/>
+          <w:rFonts w:ascii="Roboto Serif" w:hAnsi="Roboto Serif"/>
           <w:b/>
-          <w:caps/>
-          <w:color w:val="828282"/>
-          <w:sz w:val="17"/>
+          <w:caps w:val="0"/>
+          <w:color w:val="1A1A1A"/>
+          <w:sz w:val="24"/>
         </w:rPr>
         <w:t>RATIONALE</w:t>
       </w:r>
     </w:p>
     <w:p>
       <w:pPr>
-        <w:spacing w:after="360"/>
+        <w:spacing w:before="120" w:after="120"/>
         <w:jc w:val="both"/>
       </w:pPr>
       <w:r>
@@ -690,105 +722,168 @@
           <w:color w:val="1A1A1A"/>
           <w:sz w:val="21"/>
         </w:rPr>
-        <w:t xml:space="preserve">Assort Health is a San Francisco–based, pure-play healthcare AI agents platform raising a $120M </w:t>
-      </w:r>
-      <w:r>
-        <w:rPr>
-          <w:rFonts w:ascii="Sora" w:hAnsi="Sora"/>
-          <w:b/>
-          <w:caps w:val="0"/>
-          <w:color w:val="1A1A1A"/>
-          <w:sz w:val="21"/>
-        </w:rPr>
-        <w:t>Series C</w:t>
-      </w:r>
-      <w:r>
-        <w:rPr>
-          <w:rFonts w:ascii="Sora" w:hAnsi="Sora"/>
-          <w:b w:val="0"/>
-          <w:caps w:val="0"/>
-          <w:color w:val="1A1A1A"/>
-          <w:sz w:val="21"/>
-        </w:rPr>
-        <w:t xml:space="preserve"> led by Menlo Ventures, clearly passing both the stage (Series C) and geography (US, San Francisco) gates.[3][4][5] The deal aligns strongly with ID8’s core thesis: Menlo Ventures, a Tier 1 firm, is a </w:t>
-      </w:r>
-      <w:r>
-        <w:rPr>
-          <w:rFonts w:ascii="Sora" w:hAnsi="Sora"/>
-          <w:b/>
-          <w:caps w:val="0"/>
-          <w:color w:val="1A1A1A"/>
-          <w:sz w:val="21"/>
-        </w:rPr>
-        <w:t>new-money lead</w:t>
-      </w:r>
-      <w:r>
-        <w:rPr>
-          <w:rFonts w:ascii="Sora" w:hAnsi="Sora"/>
-          <w:b w:val="0"/>
-          <w:caps w:val="0"/>
-          <w:color w:val="1A1A1A"/>
-          <w:sz w:val="21"/>
-        </w:rPr>
-        <w:t xml:space="preserve"> at Series C rather than an insider extension, which ID8’s backtesting flags as the most predictive pattern for strong returns.[3][5][9] Fundamentals look promising but are not quantitatively disclosed, so the overall fit is driven more by round dynamics, AI centrality, and upside potential than by hard operating metrics.</w:t>
+        <w:t>Assort Health is a San Francisco–based, Series C-stage, pure-play healthcare AI agents platform, so it passes ID8’s stage and developed-market geography gates and sits squarely in the target Series C universe.[3][8] The deal broadly aligns with ID8’s thesis in that Menlo Ventures is leading a new-money Series C with a strong syndicate, but Menlo is more ‘near-top-tier’ than clearly Tier 1, so fit to the strict ‘new-money Tier 1 lead’ requirement is partial rather than perfect.[3][9] Fundamentals and terms are not well disclosed publicly, so while the AI and market positioning look attractive and suggest solid return potential, the lack of hard operating metrics and deal-structure detail should keep this in a moderate- to high-quality band pending deeper diligence.</w:t>
       </w:r>
     </w:p>
     <w:p>
+      <w:pPr>
+        <w:spacing w:before="80"/>
+      </w:pPr>
       <w:r>
         <w:rPr>
           <w:rFonts w:ascii="Sora" w:hAnsi="Sora"/>
           <w:b w:val="0"/>
           <w:caps w:val="0"/>
           <w:color w:val="828282"/>
-          <w:sz w:val="17"/>
+          <w:sz w:val="18"/>
         </w:rPr>
-        <w:t>Confidence: medium   ·   Screened 2026-06-29   ·   ID8 Investments — Confidential</w:t>
-      </w:r>
-    </w:p>
-    <w:p>
-      <w:r>
-        <w:drawing>
-          <wp:inline xmlns:a="http://schemas.openxmlformats.org/drawingml/2006/main" xmlns:pic="http://schemas.openxmlformats.org/drawingml/2006/picture">
-            <wp:extent cx="731520" cy="72277"/>
-            <wp:docPr id="1" name="Picture 1"/>
-            <wp:cNvGraphicFramePr>
-              <a:graphicFrameLocks noChangeAspect="1"/>
-            </wp:cNvGraphicFramePr>
-            <a:graphic>
-              <a:graphicData uri="http://schemas.openxmlformats.org/drawingml/2006/picture">
-                <pic:pic>
-                  <pic:nvPicPr>
-                    <pic:cNvPr id="0" name="id8_charcoal.png"/>
-                    <pic:cNvPicPr/>
-                  </pic:nvPicPr>
-                  <pic:blipFill>
-                    <a:blip r:embed="rId9"/>
-                    <a:stretch>
-                      <a:fillRect/>
-                    </a:stretch>
-                  </pic:blipFill>
-                  <pic:spPr>
-                    <a:xfrm>
-                      <a:off x="0" y="0"/>
-                      <a:ext cx="731520" cy="72277"/>
-                    </a:xfrm>
-                    <a:prstGeom prst="rect"/>
-                  </pic:spPr>
-                </pic:pic>
-              </a:graphicData>
-            </a:graphic>
-          </wp:inline>
-        </w:drawing>
+        <w:t>Confidence: medium</w:t>
       </w:r>
     </w:p>
     <w:sectPr>
+      <w:footerReference w:type="default" r:id="rId9"/>
+      <w:headerReference w:type="default" r:id="rId10"/>
       <w:pgSz w:w="12240" w:h="15840"/>
-      <w:pgMar w:top="1080" w:right="1296" w:bottom="1080" w:left="1296" w:header="720" w:footer="720" w:gutter="0"/>
+      <w:pgMar w:top="1440" w:right="1440" w:bottom="1440" w:left="1440" w:header="720" w:footer="720" w:gutter="0"/>
       <w:cols w:space="720"/>
       <w:docGrid w:linePitch="360"/>
     </w:sectPr>
   </w:body>
 </w:document>
+</file>
+
+<file path=word/footer1.xml><?xml version="1.0" encoding="utf-8"?>
+<w:ftr xmlns:m="http://schemas.openxmlformats.org/officeDocument/2006/math" xmlns:mc="http://schemas.openxmlformats.org/markup-compatibility/2006" xmlns:mo="http://schemas.microsoft.com/office/mac/office/2008/main" xmlns:mv="urn:schemas-microsoft-com:mac:vml" xmlns:o="urn:schemas-microsoft-com:office:office" xmlns:r="http://schemas.openxmlformats.org/officeDocument/2006/relationships" xmlns:v="urn:schemas-microsoft-com:vml" xmlns:w10="urn:schemas-microsoft-com:office:word" xmlns:w14="http://schemas.microsoft.com/office/word/2010/wordml" xmlns:w="http://schemas.openxmlformats.org/wordprocessingml/2006/main" xmlns:wne="http://schemas.microsoft.com/office/word/2006/wordml" xmlns:wp14="http://schemas.microsoft.com/office/word/2010/wordprocessingDrawing" xmlns:wp="http://schemas.openxmlformats.org/drawingml/2006/wordprocessingDrawing" xmlns:wpc="http://schemas.microsoft.com/office/word/2010/wordprocessingCanvas" xmlns:wpg="http://schemas.microsoft.com/office/word/2010/wordprocessingGroup" xmlns:wpi="http://schemas.microsoft.com/office/word/2010/wordprocessingInk" xmlns:wps="http://schemas.microsoft.com/office/word/2010/wordprocessingShape" mc:Ignorable="w14 wp14">
+  <w:p>
+    <w:pPr>
+      <w:pStyle w:val="Footer"/>
+      <w:jc w:val="center"/>
+    </w:pPr>
+    <w:r>
+      <w:rPr>
+        <w:rFonts w:ascii="Sora" w:hAnsi="Sora"/>
+        <w:b w:val="0"/>
+        <w:caps w:val="0"/>
+        <w:color w:val="828282"/>
+        <w:sz w:val="17"/>
+      </w:rPr>
+      <w:t xml:space="preserve">Page </w:t>
+    </w:r>
+    <w:fldChar w:fldCharType="begin"/>
+    <w:instrText xml:space="preserve"> PAGE </w:instrText>
+    <w:fldChar w:fldCharType="end"/>
+    <w:r>
+      <w:rPr>
+        <w:rFonts w:ascii="Sora" w:hAnsi="Sora"/>
+        <w:b w:val="0"/>
+        <w:caps w:val="0"/>
+        <w:color w:val="828282"/>
+        <w:sz w:val="17"/>
+      </w:rPr>
+      <w:t xml:space="preserve"> of </w:t>
+    </w:r>
+    <w:fldChar w:fldCharType="begin"/>
+    <w:instrText xml:space="preserve"> NUMPAGES </w:instrText>
+    <w:fldChar w:fldCharType="end"/>
+  </w:p>
+</w:ftr>
+</file>
+
+<file path=word/header1.xml><?xml version="1.0" encoding="utf-8"?>
+<w:hdr xmlns:m="http://schemas.openxmlformats.org/officeDocument/2006/math" xmlns:mc="http://schemas.openxmlformats.org/markup-compatibility/2006" xmlns:mo="http://schemas.microsoft.com/office/mac/office/2008/main" xmlns:mv="urn:schemas-microsoft-com:mac:vml" xmlns:o="urn:schemas-microsoft-com:office:office" xmlns:r="http://schemas.openxmlformats.org/officeDocument/2006/relationships" xmlns:v="urn:schemas-microsoft-com:vml" xmlns:w10="urn:schemas-microsoft-com:office:word" xmlns:w14="http://schemas.microsoft.com/office/word/2010/wordml" xmlns:w="http://schemas.openxmlformats.org/wordprocessingml/2006/main" xmlns:wne="http://schemas.microsoft.com/office/word/2006/wordml" xmlns:wp14="http://schemas.microsoft.com/office/word/2010/wordprocessingDrawing" xmlns:wp="http://schemas.openxmlformats.org/drawingml/2006/wordprocessingDrawing" xmlns:wpc="http://schemas.microsoft.com/office/word/2010/wordprocessingCanvas" xmlns:wpg="http://schemas.microsoft.com/office/word/2010/wordprocessingGroup" xmlns:wpi="http://schemas.microsoft.com/office/word/2010/wordprocessingInk" xmlns:wps="http://schemas.microsoft.com/office/word/2010/wordprocessingShape" mc:Ignorable="w14 wp14">
+  <w:p>
+    <w:pPr>
+      <w:pStyle w:val="Header"/>
+    </w:pPr>
+  </w:p>
+  <w:tbl>
+    <w:tblPr>
+      <w:tblW w:type="auto" w:w="0"/>
+      <w:tblLayout w:type="fixed"/>
+      <w:tblLook w:firstColumn="1" w:firstRow="1" w:lastColumn="0" w:lastRow="0" w:noHBand="0" w:noVBand="1" w:val="04A0"/>
+    </w:tblPr>
+    <w:tblGrid>
+      <w:gridCol w:w="1440"/>
+      <w:gridCol w:w="7920"/>
+    </w:tblGrid>
+    <w:tr>
+      <w:tc>
+        <w:tcPr>
+          <w:tcW w:type="dxa" w:w="4680"/>
+          <w:tcBorders>
+            <w:top w:val="nil"/>
+            <w:left w:val="nil"/>
+            <w:right w:val="nil"/>
+            <w:bottom w:val="single" w:sz="4" w:color="1A1A1A"/>
+          </w:tcBorders>
+        </w:tcPr>
+        <w:p>
+          <w:r>
+            <w:drawing>
+              <wp:inline xmlns:a="http://schemas.openxmlformats.org/drawingml/2006/main" xmlns:pic="http://schemas.openxmlformats.org/drawingml/2006/picture">
+                <wp:extent cx="594360" cy="58725"/>
+                <wp:docPr id="1" name="Picture 1"/>
+                <wp:cNvGraphicFramePr>
+                  <a:graphicFrameLocks noChangeAspect="1"/>
+                </wp:cNvGraphicFramePr>
+                <a:graphic>
+                  <a:graphicData uri="http://schemas.openxmlformats.org/drawingml/2006/picture">
+                    <pic:pic>
+                      <pic:nvPicPr>
+                        <pic:cNvPr id="0" name="id8_charcoal.png"/>
+                        <pic:cNvPicPr/>
+                      </pic:nvPicPr>
+                      <pic:blipFill>
+                        <a:blip r:embed="rId1"/>
+                        <a:stretch>
+                          <a:fillRect/>
+                        </a:stretch>
+                      </pic:blipFill>
+                      <pic:spPr>
+                        <a:xfrm>
+                          <a:off x="0" y="0"/>
+                          <a:ext cx="594360" cy="58725"/>
+                        </a:xfrm>
+                        <a:prstGeom prst="rect"/>
+                      </pic:spPr>
+                    </pic:pic>
+                  </a:graphicData>
+                </a:graphic>
+              </wp:inline>
+            </w:drawing>
+          </w:r>
+        </w:p>
+      </w:tc>
+      <w:tc>
+        <w:tcPr>
+          <w:tcW w:type="dxa" w:w="4680"/>
+          <w:tcBorders>
+            <w:top w:val="nil"/>
+            <w:left w:val="nil"/>
+            <w:right w:val="nil"/>
+            <w:bottom w:val="single" w:sz="4" w:color="1A1A1A"/>
+          </w:tcBorders>
+        </w:tcPr>
+        <w:p>
+          <w:pPr>
+            <w:spacing w:before="80"/>
+            <w:jc w:val="right"/>
+          </w:pPr>
+          <w:r>
+            <w:rPr>
+              <w:rFonts w:ascii="Sora" w:hAnsi="Sora"/>
+              <w:b w:val="0"/>
+              <w:caps/>
+              <w:color w:val="828282"/>
+              <w:sz w:val="16"/>
+            </w:rPr>
+            <w:t>DEAL SCREEN  ·  ID8 INVESTMENTS  ·  CONFIDENTIAL</w:t>
+          </w:r>
+        </w:p>
+      </w:tc>
+    </w:tr>
+  </w:tbl>
+</w:hdr>
 </file>
 
 <file path=word/numbering.xml><?xml version="1.0" encoding="utf-8"?>

</xml_diff>